<commit_message>
adding new version of notebook
</commit_message>
<xml_diff>
--- a/for_our_reference/Presentation Outline.docx
+++ b/for_our_reference/Presentation Outline.docx
@@ -54,6 +54,25 @@
           <w:lang w:val="en-CH"/>
         </w:rPr>
         <w:t>MF-VAR or MIDAS?</w:t>
+      </w:r>
+    </w:p>
+    <w:p>
+      <w:pPr>
+        <w:rPr>
+          <w:lang w:val="en-CH"/>
+        </w:rPr>
+      </w:pPr>
+      <w:r>
+        <w:t xml:space="preserve">pros and cons MIDAS and MF-VAR, </w:t>
+      </w:r>
+      <w:r>
+        <w:t>MIDAS</w:t>
+      </w:r>
+      <w:r>
+        <w:t xml:space="preserve"> is reduced form</w:t>
+      </w:r>
+      <w:r>
+        <w:t xml:space="preserve"> of MF-VAR</w:t>
       </w:r>
     </w:p>
     <w:p>

</xml_diff>